<commit_message>
docs: add weekly progress report issue template + fork/collaboration guidance
Adds .github/ISSUE_TEMPLATE/weekly_progress_report.md — auto-populates
when a student or collaborator clicks 'New Issue' on this repo.
Required fields: name, project (Gstack Tutorial #1), submission date
(DD/MM/YYYY), plus a progress checklist matching the 5-review workflow,
blockers, questions, and next steps.

Also adds .github/ISSUE_TEMPLATE/config.yml linking to the setup guides,
and updates GSTACK_TUTORIAL_1_WORKFLOW_PLAYBOOK.docx with a new
'Collaboration Model' section covering:
- Fork vs branch comparison table (assignment-evaluation pattern)
- A correction to the standard fork-permission reference material:
  this repo is private, so forking requires collaborator access first
- Step-by-step fork/clone/practice instructions
- Weekly reporting cadence and where reports go (original repo's Issues,
  not the student's own fork)

Co-Authored-By: Claude Sonnet 5 <noreply@anthropic.com>
</commit_message>
<xml_diff>
--- a/GSTACK_TUTORIAL_1_WORKFLOW_PLAYBOOK.docx
+++ b/GSTACK_TUTORIAL_1_WORKFLOW_PLAYBOOK.docx
@@ -3011,7 +3011,50 @@
           <w:sz w:val="28"/>
           <w:szCs w:val="28"/>
         </w:rPr>
-        <w:t xml:space="preserve">Final Deliverables Inventory</w:t>
+        <w:t xml:space="preserve">Collaboration Model — Fork, Practice, Report</w:t>
+      </w:r>
+    </w:p>
+    <w:p>
+      <w:pPr>
+        <w:spacing w:after="200" w:line="240"/>
+      </w:pPr>
+      <w:r>
+        <w:rPr>
+          <w:rFonts w:ascii="Calibri" w:cs="Calibri" w:eastAsia="Calibri" w:hAnsi="Calibri"/>
+          <w:sz w:val="22"/>
+          <w:szCs w:val="22"/>
+        </w:rPr>
+        <w:t xml:space="preserve">Tutorial #1 was built solo, in one repo. Rolling it out to a class or a team of collaborators needs a different pattern: each person needs their own space to work and make mistakes in, while the instructor still needs a single place to track everyone's progress. This is the same pattern used in coding bootcamps, technical hiring pipelines, and classroom assignments — an instructor publishes a template repository, and each student forks it rather than working directly in the original.</w:t>
+      </w:r>
+    </w:p>
+    <w:p>
+      <w:pPr>
+        <w:pStyle w:val="Heading2"/>
+        <w:spacing w:after="150" w:before="300" w:line="280"/>
+      </w:pPr>
+      <w:r>
+        <w:rPr>
+          <w:rFonts w:ascii="Calibri" w:cs="Calibri" w:eastAsia="Calibri" w:hAnsi="Calibri"/>
+          <w:b/>
+          <w:bCs/>
+          <w:color w:val="1F4E78"/>
+          <w:sz w:val="24"/>
+          <w:szCs w:val="24"/>
+        </w:rPr>
+        <w:t xml:space="preserve">Why Fork Instead of Branch</w:t>
+      </w:r>
+    </w:p>
+    <w:p>
+      <w:pPr>
+        <w:spacing w:after="200" w:line="240"/>
+      </w:pPr>
+      <w:r>
+        <w:rPr>
+          <w:rFonts w:ascii="Calibri" w:cs="Calibri" w:eastAsia="Calibri" w:hAnsi="Calibri"/>
+          <w:sz w:val="22"/>
+          <w:szCs w:val="22"/>
+        </w:rPr>
+        <w:t xml:space="preserve">A branch and a fork solve different problems. A branch is for one person (or a small trusted team) making changes inside a repo they already have push access to. A fork is for many independent people, each of whom needs their own copy to experiment freely without touching anyone else's work or needing write access to the original.</w:t>
       </w:r>
     </w:p>
     <w:tbl>
@@ -3046,7 +3089,7 @@
                 <w:sz w:val="19"/>
                 <w:szCs w:val="19"/>
               </w:rPr>
-              <w:t xml:space="preserve">File</w:t>
+              <w:t xml:space="preserve">Feature</w:t>
             </w:r>
           </w:p>
         </w:tc>
@@ -3064,7 +3107,7 @@
                 <w:sz w:val="19"/>
                 <w:szCs w:val="19"/>
               </w:rPr>
-              <w:t xml:space="preserve">Type</w:t>
+              <w:t xml:space="preserve">Git Branch</w:t>
             </w:r>
           </w:p>
         </w:tc>
@@ -3082,7 +3125,7 @@
                 <w:sz w:val="19"/>
                 <w:szCs w:val="19"/>
               </w:rPr>
-              <w:t xml:space="preserve">Purpose</w:t>
+              <w:t xml:space="preserve">GitHub Fork</w:t>
             </w:r>
           </w:p>
         </w:tc>
@@ -3096,31 +3139,31 @@
                 <w:sz w:val="19"/>
                 <w:szCs w:val="19"/>
               </w:rPr>
-              <w:t xml:space="preserve">GSTACK_TEAM_MODE_TUTORIAL.docx</w:t>
-            </w:r>
-          </w:p>
-        </w:tc>
-        <w:tc>
-          <w:p>
-            <w:r>
-              <w:rPr>
-                <w:rFonts w:ascii="Calibri" w:cs="Calibri" w:eastAsia="Calibri" w:hAnsi="Calibri"/>
-                <w:sz w:val="19"/>
-                <w:szCs w:val="19"/>
-              </w:rPr>
-              <w:t xml:space="preserve">Word, EN</w:t>
-            </w:r>
-          </w:p>
-        </w:tc>
-        <w:tc>
-          <w:p>
-            <w:r>
-              <w:rPr>
-                <w:rFonts w:ascii="Calibri" w:cs="Calibri" w:eastAsia="Calibri" w:hAnsi="Calibri"/>
-                <w:sz w:val="19"/>
-                <w:szCs w:val="19"/>
-              </w:rPr>
-              <w:t xml:space="preserve">Full team-training tutorial</w:t>
+              <w:t xml:space="preserve">Location</w:t>
+            </w:r>
+          </w:p>
+        </w:tc>
+        <w:tc>
+          <w:p>
+            <w:r>
+              <w:rPr>
+                <w:rFonts w:ascii="Calibri" w:cs="Calibri" w:eastAsia="Calibri" w:hAnsi="Calibri"/>
+                <w:sz w:val="19"/>
+                <w:szCs w:val="19"/>
+              </w:rPr>
+              <w:t xml:space="preserve">Inside an existing repository</w:t>
+            </w:r>
+          </w:p>
+        </w:tc>
+        <w:tc>
+          <w:p>
+            <w:r>
+              <w:rPr>
+                <w:rFonts w:ascii="Calibri" w:cs="Calibri" w:eastAsia="Calibri" w:hAnsi="Calibri"/>
+                <w:sz w:val="19"/>
+                <w:szCs w:val="19"/>
+              </w:rPr>
+              <w:t xml:space="preserve">A brand new repository on your own account</w:t>
             </w:r>
           </w:p>
         </w:tc>
@@ -3134,31 +3177,31 @@
                 <w:sz w:val="19"/>
                 <w:szCs w:val="19"/>
               </w:rPr>
-              <w:t xml:space="preserve">GSTACK_TEAM_MODE_TUTORIAL_CN.docx</w:t>
-            </w:r>
-          </w:p>
-        </w:tc>
-        <w:tc>
-          <w:p>
-            <w:r>
-              <w:rPr>
-                <w:rFonts w:ascii="Calibri" w:cs="Calibri" w:eastAsia="Calibri" w:hAnsi="Calibri"/>
-                <w:sz w:val="19"/>
-                <w:szCs w:val="19"/>
-              </w:rPr>
-              <w:t xml:space="preserve">Word, CN</w:t>
-            </w:r>
-          </w:p>
-        </w:tc>
-        <w:tc>
-          <w:p>
-            <w:r>
-              <w:rPr>
-                <w:rFonts w:ascii="Calibri" w:cs="Calibri" w:eastAsia="Calibri" w:hAnsi="Calibri"/>
-                <w:sz w:val="19"/>
-                <w:szCs w:val="19"/>
-              </w:rPr>
-              <w:t xml:space="preserve">Same, for China-based students</w:t>
+              <w:t xml:space="preserve">Permissions</w:t>
+            </w:r>
+          </w:p>
+        </w:tc>
+        <w:tc>
+          <w:p>
+            <w:r>
+              <w:rPr>
+                <w:rFonts w:ascii="Calibri" w:cs="Calibri" w:eastAsia="Calibri" w:hAnsi="Calibri"/>
+                <w:sz w:val="19"/>
+                <w:szCs w:val="19"/>
+              </w:rPr>
+              <w:t xml:space="preserve">Requires push access to the repo</w:t>
+            </w:r>
+          </w:p>
+        </w:tc>
+        <w:tc>
+          <w:p>
+            <w:r>
+              <w:rPr>
+                <w:rFonts w:ascii="Calibri" w:cs="Calibri" w:eastAsia="Calibri" w:hAnsi="Calibri"/>
+                <w:sz w:val="19"/>
+                <w:szCs w:val="19"/>
+              </w:rPr>
+              <w:t xml:space="preserve">Can be done on any public repo you can view; a private repo can only be forked by someone who already has read access — see note below</w:t>
             </w:r>
           </w:p>
         </w:tc>
@@ -3172,31 +3215,449 @@
                 <w:sz w:val="19"/>
                 <w:szCs w:val="19"/>
               </w:rPr>
-              <w:t xml:space="preserve">MCKINSEY_DOCX_PLAYBOOK.docx</w:t>
-            </w:r>
-          </w:p>
-        </w:tc>
-        <w:tc>
-          <w:p>
-            <w:r>
-              <w:rPr>
-                <w:rFonts w:ascii="Calibri" w:cs="Calibri" w:eastAsia="Calibri" w:hAnsi="Calibri"/>
-                <w:sz w:val="19"/>
-                <w:szCs w:val="19"/>
-              </w:rPr>
-              <w:t xml:space="preserve">Word</w:t>
-            </w:r>
-          </w:p>
-        </w:tc>
-        <w:tc>
-          <w:p>
-            <w:r>
-              <w:rPr>
-                <w:rFonts w:ascii="Calibri" w:cs="Calibri" w:eastAsia="Calibri" w:hAnsi="Calibri"/>
-                <w:sz w:val="19"/>
-                <w:szCs w:val="19"/>
-              </w:rPr>
-              <w:t xml:space="preserve">How to build McKinsey-style docx (technical)</w:t>
+              <w:t xml:space="preserve">Upstream Link</w:t>
+            </w:r>
+          </w:p>
+        </w:tc>
+        <w:tc>
+          <w:p>
+            <w:r>
+              <w:rPr>
+                <w:rFonts w:ascii="Calibri" w:cs="Calibri" w:eastAsia="Calibri" w:hAnsi="Calibri"/>
+                <w:sz w:val="19"/>
+                <w:szCs w:val="19"/>
+              </w:rPr>
+              <w:t xml:space="preserve">Tracks branches within the same repo</w:t>
+            </w:r>
+          </w:p>
+        </w:tc>
+        <w:tc>
+          <w:p>
+            <w:r>
+              <w:rPr>
+                <w:rFonts w:ascii="Calibri" w:cs="Calibri" w:eastAsia="Calibri" w:hAnsi="Calibri"/>
+                <w:sz w:val="19"/>
+                <w:szCs w:val="19"/>
+              </w:rPr>
+              <w:t xml:space="preserve">Tracks an entirely separate owner's repo as "upstream"</w:t>
+            </w:r>
+          </w:p>
+        </w:tc>
+      </w:tr>
+    </w:tbl>
+    <w:p>
+      <w:pPr>
+        <w:spacing w:after="200" w:line="240"/>
+      </w:pPr>
+      <w:r>
+        <w:rPr>
+          <w:rFonts w:ascii="Calibri" w:cs="Calibri" w:eastAsia="Calibri" w:hAnsi="Calibri"/>
+          <w:sz w:val="22"/>
+          <w:szCs w:val="22"/>
+        </w:rPr>
+        <w:t xml:space="preserve">Why this matters for grading and review: with everyone working in their own fork, the reviewer can open any student's fork, see exactly what they changed against the original, and comment directly on their pull requests or commits — without anyone's work colliding with anyone else's.</w:t>
+      </w:r>
+    </w:p>
+    <w:p>
+      <w:pPr>
+        <w:pBdr>
+          <w:top w:val="single" w:color="C98A2C" w:sz="4" w:space="4"/>
+          <w:bottom w:val="single" w:color="C98A2C" w:sz="4" w:space="4"/>
+          <w:left w:val="single" w:color="C98A2C" w:sz="4" w:space="4"/>
+          <w:right w:val="single" w:color="C98A2C" w:sz="4" w:space="4"/>
+        </w:pBdr>
+        <w:shd w:fill="FFF3E0" w:val="clear"/>
+        <w:spacing w:after="200" w:before="200" w:line="240"/>
+      </w:pPr>
+      <w:r>
+        <w:rPr>
+          <w:rFonts w:ascii="Calibri" w:cs="Calibri" w:eastAsia="Calibri" w:hAnsi="Calibri"/>
+          <w:b/>
+          <w:bCs/>
+          <w:color w:val="8A5A00"/>
+          <w:sz w:val="22"/>
+          <w:szCs w:val="22"/>
+        </w:rPr>
+        <w:t xml:space="preserve">Correction to the standard reference material: </w:t>
+      </w:r>
+      <w:r>
+        <w:rPr>
+          <w:rFonts w:ascii="Calibri" w:cs="Calibri" w:eastAsia="Calibri" w:hAnsi="Calibri"/>
+          <w:sz w:val="21"/>
+          <w:szCs w:val="21"/>
+        </w:rPr>
+        <w:t xml:space="preserve">the usual claim that forking "can be done on any public repository" assumes the source repo is public. gstack-tutorial-1 is currently PRIVATE. GitHub still allows forking a private repo, but only by someone the owner has already added as a collaborator — and the resulting fork stays private too, visible only to that person (and the owner). Every student or collaborator must be added via Settings → Collaborators (or gh repo add-collaborator) BEFORE they can fork, exactly as described in COLLABORATOR_ACCESS_GUIDE.md Step 0.</w:t>
+      </w:r>
+    </w:p>
+    <w:p>
+      <w:pPr>
+        <w:pStyle w:val="Heading2"/>
+        <w:spacing w:after="150" w:before="300" w:line="280"/>
+      </w:pPr>
+      <w:r>
+        <w:rPr>
+          <w:rFonts w:ascii="Calibri" w:cs="Calibri" w:eastAsia="Calibri" w:hAnsi="Calibri"/>
+          <w:b/>
+          <w:bCs/>
+          <w:color w:val="1F4E78"/>
+          <w:sz w:val="24"/>
+          <w:szCs w:val="24"/>
+        </w:rPr>
+        <w:t xml:space="preserve">Step-by-Step: Fork, Clone, Practice</w:t>
+      </w:r>
+    </w:p>
+    <w:p>
+      <w:pPr>
+        <w:pStyle w:val="ListParagraph"/>
+        <w:numPr>
+          <w:ilvl w:val="0"/>
+          <w:numId w:val="1"/>
+        </w:numPr>
+        <w:spacing w:after="80" w:before="80" w:line="240"/>
+        <w:ind w:left="0"/>
+      </w:pPr>
+      <w:r>
+        <w:rPr>
+          <w:rFonts w:ascii="Calibri" w:cs="Calibri" w:eastAsia="Calibri" w:hAnsi="Calibri"/>
+          <w:sz w:val="22"/>
+          <w:szCs w:val="22"/>
+        </w:rPr>
+        <w:t xml:space="preserve">1. Get added as a collaborator on the original repo (COLLABORATOR_ACCESS_GUIDE.md, Step 0 — the owner does this).</w:t>
+      </w:r>
+    </w:p>
+    <w:p>
+      <w:pPr>
+        <w:pStyle w:val="ListParagraph"/>
+        <w:numPr>
+          <w:ilvl w:val="0"/>
+          <w:numId w:val="1"/>
+        </w:numPr>
+        <w:spacing w:after="80" w:before="80" w:line="240"/>
+        <w:ind w:left="0"/>
+      </w:pPr>
+      <w:r>
+        <w:rPr>
+          <w:rFonts w:ascii="Calibri" w:cs="Calibri" w:eastAsia="Calibri" w:hAnsi="Calibri"/>
+          <w:sz w:val="22"/>
+          <w:szCs w:val="22"/>
+        </w:rPr>
+        <w:t xml:space="preserve">2. On https://github.com/mikelix/gstack-tutorial-1, click Fork (top right) → choose your own account as the destination.</w:t>
+      </w:r>
+    </w:p>
+    <w:p>
+      <w:pPr>
+        <w:pStyle w:val="ListParagraph"/>
+        <w:numPr>
+          <w:ilvl w:val="0"/>
+          <w:numId w:val="1"/>
+        </w:numPr>
+        <w:spacing w:after="80" w:before="80" w:line="240"/>
+        <w:ind w:left="0"/>
+      </w:pPr>
+      <w:r>
+        <w:rPr>
+          <w:rFonts w:ascii="Calibri" w:cs="Calibri" w:eastAsia="Calibri" w:hAnsi="Calibri"/>
+          <w:sz w:val="22"/>
+          <w:szCs w:val="22"/>
+        </w:rPr>
+        <w:t xml:space="preserve">3. Clone YOUR fork, not the original: git clone https://github.com/&lt;your-username&gt;/gstack-tutorial-1.git</w:t>
+      </w:r>
+    </w:p>
+    <w:p>
+      <w:pPr>
+        <w:pStyle w:val="ListParagraph"/>
+        <w:numPr>
+          <w:ilvl w:val="0"/>
+          <w:numId w:val="1"/>
+        </w:numPr>
+        <w:spacing w:after="80" w:before="80" w:line="240"/>
+        <w:ind w:left="0"/>
+      </w:pPr>
+      <w:r>
+        <w:rPr>
+          <w:rFonts w:ascii="Calibri" w:cs="Calibri" w:eastAsia="Calibri" w:hAnsi="Calibri"/>
+          <w:sz w:val="22"/>
+          <w:szCs w:val="22"/>
+        </w:rPr>
+        <w:t xml:space="preserve">4. Optional but recommended — link the original as "upstream" so you can pull future updates: git remote add upstream https://github.com/mikelix/gstack-tutorial-1.git</w:t>
+      </w:r>
+    </w:p>
+    <w:p>
+      <w:pPr>
+        <w:pStyle w:val="ListParagraph"/>
+        <w:numPr>
+          <w:ilvl w:val="0"/>
+          <w:numId w:val="1"/>
+        </w:numPr>
+        <w:spacing w:after="80" w:before="80" w:line="240"/>
+        <w:ind w:left="0"/>
+      </w:pPr>
+      <w:r>
+        <w:rPr>
+          <w:rFonts w:ascii="Calibri" w:cs="Calibri" w:eastAsia="Calibri" w:hAnsi="Calibri"/>
+          <w:sz w:val="22"/>
+          <w:szCs w:val="22"/>
+        </w:rPr>
+        <w:t xml:space="preserve">5. Open your own gstack-enabled assistant — Claude Code, OpenAI Codex, or Tencent Workbuddy, whichever you installed — inside your cloned fork.</w:t>
+      </w:r>
+    </w:p>
+    <w:p>
+      <w:pPr>
+        <w:pStyle w:val="ListParagraph"/>
+        <w:numPr>
+          <w:ilvl w:val="0"/>
+          <w:numId w:val="1"/>
+        </w:numPr>
+        <w:spacing w:after="80" w:before="80" w:line="240"/>
+        <w:ind w:left="0"/>
+      </w:pPr>
+      <w:r>
+        <w:rPr>
+          <w:rFonts w:ascii="Calibri" w:cs="Calibri" w:eastAsia="Calibri" w:hAnsi="Calibri"/>
+          <w:sz w:val="22"/>
+          <w:szCs w:val="22"/>
+        </w:rPr>
+        <w:t xml:space="preserve">6. Ask it directly to examine the repo: “Read START_HERE.md, PLAN.md, and the five review documents in this repo, then help me run the same five gstack reviews myself.”</w:t>
+      </w:r>
+    </w:p>
+    <w:p>
+      <w:pPr>
+        <w:pStyle w:val="ListParagraph"/>
+        <w:numPr>
+          <w:ilvl w:val="0"/>
+          <w:numId w:val="1"/>
+        </w:numPr>
+        <w:spacing w:after="80" w:before="80" w:line="240"/>
+        <w:ind w:left="0"/>
+      </w:pPr>
+      <w:r>
+        <w:rPr>
+          <w:rFonts w:ascii="Calibri" w:cs="Calibri" w:eastAsia="Calibri" w:hAnsi="Calibri"/>
+          <w:sz w:val="22"/>
+          <w:szCs w:val="22"/>
+        </w:rPr>
+        <w:t xml:space="preserve">7. Practice the full workflow hands-on in your fork: install gstack, run all five reviews, implement the plan, commit your own results. This is the same 5-phase sequence documented in Phase 1 of this playbook — now you are the one running it, not just reading about it.</w:t>
+      </w:r>
+    </w:p>
+    <w:p>
+      <w:pPr>
+        <w:pStyle w:val="Heading2"/>
+        <w:spacing w:after="150" w:before="300" w:line="280"/>
+      </w:pPr>
+      <w:r>
+        <w:rPr>
+          <w:rFonts w:ascii="Calibri" w:cs="Calibri" w:eastAsia="Calibri" w:hAnsi="Calibri"/>
+          <w:b/>
+          <w:bCs/>
+          <w:color w:val="1F4E78"/>
+          <w:sz w:val="24"/>
+          <w:szCs w:val="24"/>
+        </w:rPr>
+        <w:t xml:space="preserve">Weekly Progress Reporting</w:t>
+      </w:r>
+    </w:p>
+    <w:p>
+      <w:pPr>
+        <w:spacing w:after="200" w:line="240"/>
+      </w:pPr>
+      <w:r>
+        <w:rPr>
+          <w:rFonts w:ascii="Calibri" w:cs="Calibri" w:eastAsia="Calibri" w:hAnsi="Calibri"/>
+          <w:sz w:val="22"/>
+          <w:szCs w:val="22"/>
+        </w:rPr>
+        <w:t xml:space="preserve">Once a week, every student or collaborator posts a progress report as a GitHub Issue — but on the ORIGINAL repo (mikelix/gstack-tutorial-1/issues), not their own fork's issues. This is the single place the instructor checks everyone's status.</w:t>
+      </w:r>
+    </w:p>
+    <w:p>
+      <w:pPr>
+        <w:pStyle w:val="ListParagraph"/>
+        <w:numPr>
+          <w:ilvl w:val="0"/>
+          <w:numId w:val="1"/>
+        </w:numPr>
+        <w:spacing w:after="80" w:before="80" w:line="240"/>
+        <w:ind w:left="0"/>
+      </w:pPr>
+      <w:r>
+        <w:rPr>
+          <w:rFonts w:ascii="Calibri" w:cs="Calibri" w:eastAsia="Calibri" w:hAnsi="Calibri"/>
+          <w:sz w:val="22"/>
+          <w:szCs w:val="22"/>
+        </w:rPr>
+        <w:t xml:space="preserve">Cadence: weekly, even if progress was small — a report saying “stuck on X” is still useful data.</w:t>
+      </w:r>
+    </w:p>
+    <w:p>
+      <w:pPr>
+        <w:pStyle w:val="ListParagraph"/>
+        <w:numPr>
+          <w:ilvl w:val="0"/>
+          <w:numId w:val="1"/>
+        </w:numPr>
+        <w:spacing w:after="80" w:before="80" w:line="240"/>
+        <w:ind w:left="0"/>
+      </w:pPr>
+      <w:r>
+        <w:rPr>
+          <w:rFonts w:ascii="Calibri" w:cs="Calibri" w:eastAsia="Calibri" w:hAnsi="Calibri"/>
+          <w:sz w:val="22"/>
+          <w:szCs w:val="22"/>
+        </w:rPr>
+        <w:t xml:space="preserve">Where: https://github.com/mikelix/gstack-tutorial-1/issues — click New Issue, select “Weekly Progress Report.”</w:t>
+      </w:r>
+    </w:p>
+    <w:p>
+      <w:pPr>
+        <w:pStyle w:val="ListParagraph"/>
+        <w:numPr>
+          <w:ilvl w:val="0"/>
+          <w:numId w:val="1"/>
+        </w:numPr>
+        <w:spacing w:after="80" w:before="80" w:line="240"/>
+        <w:ind w:left="0"/>
+      </w:pPr>
+      <w:r>
+        <w:rPr>
+          <w:rFonts w:ascii="Calibri" w:cs="Calibri" w:eastAsia="Calibri" w:hAnsi="Calibri"/>
+          <w:sz w:val="22"/>
+          <w:szCs w:val="22"/>
+        </w:rPr>
+        <w:t xml:space="preserve">Required fields: reporter name, project (Gstack Tutorial #1), and submission date in DD/MM/YYYY format — these three are non-negotiable and appear at the top of the template.</w:t>
+      </w:r>
+    </w:p>
+    <w:p>
+      <w:pPr>
+        <w:pStyle w:val="ListParagraph"/>
+        <w:numPr>
+          <w:ilvl w:val="0"/>
+          <w:numId w:val="1"/>
+        </w:numPr>
+        <w:spacing w:after="80" w:before="80" w:line="240"/>
+        <w:ind w:left="0"/>
+      </w:pPr>
+      <w:r>
+        <w:rPr>
+          <w:rFonts w:ascii="Calibri" w:cs="Calibri" w:eastAsia="Calibri" w:hAnsi="Calibri"/>
+          <w:sz w:val="22"/>
+          <w:szCs w:val="22"/>
+        </w:rPr>
+        <w:t xml:space="preserve">The issue template is committed at .github/ISSUE_TEMPLATE/weekly_progress_report.md — it auto-populates when a student clicks New Issue, so nobody has to remember the format.</w:t>
+      </w:r>
+    </w:p>
+    <w:p>
+      <w:pPr>
+        <w:pStyle w:val="ListParagraph"/>
+        <w:numPr>
+          <w:ilvl w:val="0"/>
+          <w:numId w:val="1"/>
+        </w:numPr>
+        <w:spacing w:after="80" w:before="80" w:line="240"/>
+        <w:ind w:left="0"/>
+      </w:pPr>
+      <w:r>
+        <w:rPr>
+          <w:rFonts w:ascii="Calibri" w:cs="Calibri" w:eastAsia="Calibri" w:hAnsi="Calibri"/>
+          <w:sz w:val="22"/>
+          <w:szCs w:val="22"/>
+        </w:rPr>
+        <w:t xml:space="preserve">Link your fork in the report so the reviewer can jump straight to your actual commits.</w:t>
+      </w:r>
+    </w:p>
+    <w:p>
+      <w:r>
+        <w:br w:type="page"/>
+      </w:r>
+    </w:p>
+    <w:p>
+      <w:pPr>
+        <w:pStyle w:val="Heading1"/>
+        <w:pBdr>
+          <w:bottom w:val="single" w:color="1F4E78" w:sz="12" w:space="1"/>
+        </w:pBdr>
+        <w:spacing w:after="200" w:before="400" w:line="360"/>
+      </w:pPr>
+      <w:r>
+        <w:rPr>
+          <w:rFonts w:ascii="Calibri" w:cs="Calibri" w:eastAsia="Calibri" w:hAnsi="Calibri"/>
+          <w:b/>
+          <w:bCs/>
+          <w:color w:val="1F4E78"/>
+          <w:sz w:val="28"/>
+          <w:szCs w:val="28"/>
+        </w:rPr>
+        <w:t xml:space="preserve">Final Deliverables Inventory</w:t>
+      </w:r>
+    </w:p>
+    <w:tbl>
+      <w:tblPr>
+        <w:tblW w:type="pct" w:w="100%"/>
+        <w:tblBorders>
+          <w:top w:val="single" w:color="auto" w:sz="4"/>
+          <w:left w:val="single" w:color="auto" w:sz="4"/>
+          <w:bottom w:val="single" w:color="auto" w:sz="4"/>
+          <w:right w:val="single" w:color="auto" w:sz="4"/>
+          <w:insideH w:val="single" w:color="auto" w:sz="4"/>
+          <w:insideV w:val="single" w:color="auto" w:sz="4"/>
+        </w:tblBorders>
+      </w:tblPr>
+      <w:tblGrid>
+        <w:gridCol w:w="100"/>
+        <w:gridCol w:w="100"/>
+        <w:gridCol w:w="100"/>
+      </w:tblGrid>
+      <w:tr>
+        <w:tc>
+          <w:tcPr>
+            <w:shd w:fill="1F4E78"/>
+          </w:tcPr>
+          <w:p>
+            <w:r>
+              <w:rPr>
+                <w:rFonts w:ascii="Calibri" w:cs="Calibri" w:eastAsia="Calibri" w:hAnsi="Calibri"/>
+                <w:b/>
+                <w:bCs/>
+                <w:color w:val="FFFFFF"/>
+                <w:sz w:val="19"/>
+                <w:szCs w:val="19"/>
+              </w:rPr>
+              <w:t xml:space="preserve">File</w:t>
+            </w:r>
+          </w:p>
+        </w:tc>
+        <w:tc>
+          <w:tcPr>
+            <w:shd w:fill="1F4E78"/>
+          </w:tcPr>
+          <w:p>
+            <w:r>
+              <w:rPr>
+                <w:rFonts w:ascii="Calibri" w:cs="Calibri" w:eastAsia="Calibri" w:hAnsi="Calibri"/>
+                <w:b/>
+                <w:bCs/>
+                <w:color w:val="FFFFFF"/>
+                <w:sz w:val="19"/>
+                <w:szCs w:val="19"/>
+              </w:rPr>
+              <w:t xml:space="preserve">Type</w:t>
+            </w:r>
+          </w:p>
+        </w:tc>
+        <w:tc>
+          <w:tcPr>
+            <w:shd w:fill="1F4E78"/>
+          </w:tcPr>
+          <w:p>
+            <w:r>
+              <w:rPr>
+                <w:rFonts w:ascii="Calibri" w:cs="Calibri" w:eastAsia="Calibri" w:hAnsi="Calibri"/>
+                <w:b/>
+                <w:bCs/>
+                <w:color w:val="FFFFFF"/>
+                <w:sz w:val="19"/>
+                <w:szCs w:val="19"/>
+              </w:rPr>
+              <w:t xml:space="preserve">Purpose</w:t>
             </w:r>
           </w:p>
         </w:tc>
@@ -3210,31 +3671,31 @@
                 <w:sz w:val="19"/>
                 <w:szCs w:val="19"/>
               </w:rPr>
-              <w:t xml:space="preserve">GSTACK_TEAM_MODE_TUTORIAL_DECK.pptx</w:t>
-            </w:r>
-          </w:p>
-        </w:tc>
-        <w:tc>
-          <w:p>
-            <w:r>
-              <w:rPr>
-                <w:rFonts w:ascii="Calibri" w:cs="Calibri" w:eastAsia="Calibri" w:hAnsi="Calibri"/>
-                <w:sz w:val="19"/>
-                <w:szCs w:val="19"/>
-              </w:rPr>
-              <w:t xml:space="preserve">PPTX, EN</w:t>
-            </w:r>
-          </w:p>
-        </w:tc>
-        <w:tc>
-          <w:p>
-            <w:r>
-              <w:rPr>
-                <w:rFonts w:ascii="Calibri" w:cs="Calibri" w:eastAsia="Calibri" w:hAnsi="Calibri"/>
-                <w:sz w:val="19"/>
-                <w:szCs w:val="19"/>
-              </w:rPr>
-              <w:t xml:space="preserve">9-slide executive summary deck</w:t>
+              <w:t xml:space="preserve">GSTACK_TEAM_MODE_TUTORIAL.docx</w:t>
+            </w:r>
+          </w:p>
+        </w:tc>
+        <w:tc>
+          <w:p>
+            <w:r>
+              <w:rPr>
+                <w:rFonts w:ascii="Calibri" w:cs="Calibri" w:eastAsia="Calibri" w:hAnsi="Calibri"/>
+                <w:sz w:val="19"/>
+                <w:szCs w:val="19"/>
+              </w:rPr>
+              <w:t xml:space="preserve">Word, EN</w:t>
+            </w:r>
+          </w:p>
+        </w:tc>
+        <w:tc>
+          <w:p>
+            <w:r>
+              <w:rPr>
+                <w:rFonts w:ascii="Calibri" w:cs="Calibri" w:eastAsia="Calibri" w:hAnsi="Calibri"/>
+                <w:sz w:val="19"/>
+                <w:szCs w:val="19"/>
+              </w:rPr>
+              <w:t xml:space="preserve">Full team-training tutorial</w:t>
             </w:r>
           </w:p>
         </w:tc>
@@ -3248,31 +3709,31 @@
                 <w:sz w:val="19"/>
                 <w:szCs w:val="19"/>
               </w:rPr>
-              <w:t xml:space="preserve">GSTACK_TEAM_MODE_TUTORIAL_DECK_CN.pptx</w:t>
-            </w:r>
-          </w:p>
-        </w:tc>
-        <w:tc>
-          <w:p>
-            <w:r>
-              <w:rPr>
-                <w:rFonts w:ascii="Calibri" w:cs="Calibri" w:eastAsia="Calibri" w:hAnsi="Calibri"/>
-                <w:sz w:val="19"/>
-                <w:szCs w:val="19"/>
-              </w:rPr>
-              <w:t xml:space="preserve">PPTX, CN</w:t>
-            </w:r>
-          </w:p>
-        </w:tc>
-        <w:tc>
-          <w:p>
-            <w:r>
-              <w:rPr>
-                <w:rFonts w:ascii="Calibri" w:cs="Calibri" w:eastAsia="Calibri" w:hAnsi="Calibri"/>
-                <w:sz w:val="19"/>
-                <w:szCs w:val="19"/>
-              </w:rPr>
-              <w:t xml:space="preserve">Same, in Simplified Chinese</w:t>
+              <w:t xml:space="preserve">GSTACK_TEAM_MODE_TUTORIAL_CN.docx</w:t>
+            </w:r>
+          </w:p>
+        </w:tc>
+        <w:tc>
+          <w:p>
+            <w:r>
+              <w:rPr>
+                <w:rFonts w:ascii="Calibri" w:cs="Calibri" w:eastAsia="Calibri" w:hAnsi="Calibri"/>
+                <w:sz w:val="19"/>
+                <w:szCs w:val="19"/>
+              </w:rPr>
+              <w:t xml:space="preserve">Word, CN</w:t>
+            </w:r>
+          </w:p>
+        </w:tc>
+        <w:tc>
+          <w:p>
+            <w:r>
+              <w:rPr>
+                <w:rFonts w:ascii="Calibri" w:cs="Calibri" w:eastAsia="Calibri" w:hAnsi="Calibri"/>
+                <w:sz w:val="19"/>
+                <w:szCs w:val="19"/>
+              </w:rPr>
+              <w:t xml:space="preserve">Same, for China-based students</w:t>
             </w:r>
           </w:p>
         </w:tc>
@@ -3286,7 +3747,7 @@
                 <w:sz w:val="19"/>
                 <w:szCs w:val="19"/>
               </w:rPr>
-              <w:t xml:space="preserve">GSTACK_TUTORIAL_1_WORKFLOW_PLAYBOOK.docx</w:t>
+              <w:t xml:space="preserve">MCKINSEY_DOCX_PLAYBOOK.docx</w:t>
             </w:r>
           </w:p>
         </w:tc>
@@ -3310,7 +3771,7 @@
                 <w:sz w:val="19"/>
                 <w:szCs w:val="19"/>
               </w:rPr>
-              <w:t xml:space="preserve">This document — the process itself</w:t>
+              <w:t xml:space="preserve">How to build McKinsey-style docx (technical)</w:t>
             </w:r>
           </w:p>
         </w:tc>
@@ -3324,6 +3785,120 @@
                 <w:sz w:val="19"/>
                 <w:szCs w:val="19"/>
               </w:rPr>
+              <w:t xml:space="preserve">GSTACK_TEAM_MODE_TUTORIAL_DECK.pptx</w:t>
+            </w:r>
+          </w:p>
+        </w:tc>
+        <w:tc>
+          <w:p>
+            <w:r>
+              <w:rPr>
+                <w:rFonts w:ascii="Calibri" w:cs="Calibri" w:eastAsia="Calibri" w:hAnsi="Calibri"/>
+                <w:sz w:val="19"/>
+                <w:szCs w:val="19"/>
+              </w:rPr>
+              <w:t xml:space="preserve">PPTX, EN</w:t>
+            </w:r>
+          </w:p>
+        </w:tc>
+        <w:tc>
+          <w:p>
+            <w:r>
+              <w:rPr>
+                <w:rFonts w:ascii="Calibri" w:cs="Calibri" w:eastAsia="Calibri" w:hAnsi="Calibri"/>
+                <w:sz w:val="19"/>
+                <w:szCs w:val="19"/>
+              </w:rPr>
+              <w:t xml:space="preserve">9-slide executive summary deck</w:t>
+            </w:r>
+          </w:p>
+        </w:tc>
+      </w:tr>
+      <w:tr>
+        <w:tc>
+          <w:p>
+            <w:r>
+              <w:rPr>
+                <w:rFonts w:ascii="Calibri" w:cs="Calibri" w:eastAsia="Calibri" w:hAnsi="Calibri"/>
+                <w:sz w:val="19"/>
+                <w:szCs w:val="19"/>
+              </w:rPr>
+              <w:t xml:space="preserve">GSTACK_TEAM_MODE_TUTORIAL_DECK_CN.pptx</w:t>
+            </w:r>
+          </w:p>
+        </w:tc>
+        <w:tc>
+          <w:p>
+            <w:r>
+              <w:rPr>
+                <w:rFonts w:ascii="Calibri" w:cs="Calibri" w:eastAsia="Calibri" w:hAnsi="Calibri"/>
+                <w:sz w:val="19"/>
+                <w:szCs w:val="19"/>
+              </w:rPr>
+              <w:t xml:space="preserve">PPTX, CN</w:t>
+            </w:r>
+          </w:p>
+        </w:tc>
+        <w:tc>
+          <w:p>
+            <w:r>
+              <w:rPr>
+                <w:rFonts w:ascii="Calibri" w:cs="Calibri" w:eastAsia="Calibri" w:hAnsi="Calibri"/>
+                <w:sz w:val="19"/>
+                <w:szCs w:val="19"/>
+              </w:rPr>
+              <w:t xml:space="preserve">Same, in Simplified Chinese</w:t>
+            </w:r>
+          </w:p>
+        </w:tc>
+      </w:tr>
+      <w:tr>
+        <w:tc>
+          <w:p>
+            <w:r>
+              <w:rPr>
+                <w:rFonts w:ascii="Calibri" w:cs="Calibri" w:eastAsia="Calibri" w:hAnsi="Calibri"/>
+                <w:sz w:val="19"/>
+                <w:szCs w:val="19"/>
+              </w:rPr>
+              <w:t xml:space="preserve">GSTACK_TUTORIAL_1_WORKFLOW_PLAYBOOK.docx</w:t>
+            </w:r>
+          </w:p>
+        </w:tc>
+        <w:tc>
+          <w:p>
+            <w:r>
+              <w:rPr>
+                <w:rFonts w:ascii="Calibri" w:cs="Calibri" w:eastAsia="Calibri" w:hAnsi="Calibri"/>
+                <w:sz w:val="19"/>
+                <w:szCs w:val="19"/>
+              </w:rPr>
+              <w:t xml:space="preserve">Word</w:t>
+            </w:r>
+          </w:p>
+        </w:tc>
+        <w:tc>
+          <w:p>
+            <w:r>
+              <w:rPr>
+                <w:rFonts w:ascii="Calibri" w:cs="Calibri" w:eastAsia="Calibri" w:hAnsi="Calibri"/>
+                <w:sz w:val="19"/>
+                <w:szCs w:val="19"/>
+              </w:rPr>
+              <w:t xml:space="preserve">This document — the process itself</w:t>
+            </w:r>
+          </w:p>
+        </w:tc>
+      </w:tr>
+      <w:tr>
+        <w:tc>
+          <w:p>
+            <w:r>
+              <w:rPr>
+                <w:rFonts w:ascii="Calibri" w:cs="Calibri" w:eastAsia="Calibri" w:hAnsi="Calibri"/>
+                <w:sz w:val="19"/>
+                <w:szCs w:val="19"/>
+              </w:rPr>
               <w:t xml:space="preserve">GSTACK_TUTORIAL_1_WORKFLOW_PLAYBOOK_DECK.pptx</w:t>
             </w:r>
           </w:p>
@@ -3349,6 +3924,120 @@
                 <w:szCs w:val="19"/>
               </w:rPr>
               <w:t xml:space="preserve">Slide summary of this document</w:t>
+            </w:r>
+          </w:p>
+        </w:tc>
+      </w:tr>
+      <w:tr>
+        <w:tc>
+          <w:p>
+            <w:r>
+              <w:rPr>
+                <w:rFonts w:ascii="Calibri" w:cs="Calibri" w:eastAsia="Calibri" w:hAnsi="Calibri"/>
+                <w:sz w:val="19"/>
+                <w:szCs w:val="19"/>
+              </w:rPr>
+              <w:t xml:space="preserve">COLLABORATOR_ACCESS_GUIDE.md</w:t>
+            </w:r>
+          </w:p>
+        </w:tc>
+        <w:tc>
+          <w:p>
+            <w:r>
+              <w:rPr>
+                <w:rFonts w:ascii="Calibri" w:cs="Calibri" w:eastAsia="Calibri" w:hAnsi="Calibri"/>
+                <w:sz w:val="19"/>
+                <w:szCs w:val="19"/>
+              </w:rPr>
+              <w:t xml:space="preserve">Markdown</w:t>
+            </w:r>
+          </w:p>
+        </w:tc>
+        <w:tc>
+          <w:p>
+            <w:r>
+              <w:rPr>
+                <w:rFonts w:ascii="Calibri" w:cs="Calibri" w:eastAsia="Calibri" w:hAnsi="Calibri"/>
+                <w:sz w:val="19"/>
+                <w:szCs w:val="19"/>
+              </w:rPr>
+              <w:t xml:space="preserve">Fork/clone/auth setup for students and collaborators</w:t>
+            </w:r>
+          </w:p>
+        </w:tc>
+      </w:tr>
+      <w:tr>
+        <w:tc>
+          <w:p>
+            <w:r>
+              <w:rPr>
+                <w:rFonts w:ascii="Calibri" w:cs="Calibri" w:eastAsia="Calibri" w:hAnsi="Calibri"/>
+                <w:sz w:val="19"/>
+                <w:szCs w:val="19"/>
+              </w:rPr>
+              <w:t xml:space="preserve">OFFICE_SKILLS_INSTALL_GUIDE.md</w:t>
+            </w:r>
+          </w:p>
+        </w:tc>
+        <w:tc>
+          <w:p>
+            <w:r>
+              <w:rPr>
+                <w:rFonts w:ascii="Calibri" w:cs="Calibri" w:eastAsia="Calibri" w:hAnsi="Calibri"/>
+                <w:sz w:val="19"/>
+                <w:szCs w:val="19"/>
+              </w:rPr>
+              <w:t xml:space="preserve">Markdown</w:t>
+            </w:r>
+          </w:p>
+        </w:tc>
+        <w:tc>
+          <w:p>
+            <w:r>
+              <w:rPr>
+                <w:rFonts w:ascii="Calibri" w:cs="Calibri" w:eastAsia="Calibri" w:hAnsi="Calibri"/>
+                <w:sz w:val="19"/>
+                <w:szCs w:val="19"/>
+              </w:rPr>
+              <w:t xml:space="preserve">How to install the docx/pptx/xlsx/pdf skills</w:t>
+            </w:r>
+          </w:p>
+        </w:tc>
+      </w:tr>
+      <w:tr>
+        <w:tc>
+          <w:p>
+            <w:r>
+              <w:rPr>
+                <w:rFonts w:ascii="Calibri" w:cs="Calibri" w:eastAsia="Calibri" w:hAnsi="Calibri"/>
+                <w:sz w:val="19"/>
+                <w:szCs w:val="19"/>
+              </w:rPr>
+              <w:t xml:space="preserve">.github/ISSUE_TEMPLATE/weekly_progress_report.md</w:t>
+            </w:r>
+          </w:p>
+        </w:tc>
+        <w:tc>
+          <w:p>
+            <w:r>
+              <w:rPr>
+                <w:rFonts w:ascii="Calibri" w:cs="Calibri" w:eastAsia="Calibri" w:hAnsi="Calibri"/>
+                <w:sz w:val="19"/>
+                <w:szCs w:val="19"/>
+              </w:rPr>
+              <w:t xml:space="preserve">Markdown</w:t>
+            </w:r>
+          </w:p>
+        </w:tc>
+        <w:tc>
+          <w:p>
+            <w:r>
+              <w:rPr>
+                <w:rFonts w:ascii="Calibri" w:cs="Calibri" w:eastAsia="Calibri" w:hAnsi="Calibri"/>
+                <w:sz w:val="19"/>
+                <w:szCs w:val="19"/>
+              </w:rPr>
+              <w:t xml:space="preserve">Auto-populating weekly report template</w:t>
             </w:r>
           </w:p>
         </w:tc>

</xml_diff>

<commit_message>
docs: add revision-workflow section to the meta-playbook
Documents how the fork/practice + weekly-report revision cycle actually
ran, as a reusable template for the next revision:

- What triggered it (a live user question surfacing a real gap)
- The 7-step revision sequence (answer -> update playbook -> build
  mechanism -> propagate to all 4 files -> verify each -> commit/push/
  checksum-verify -> update playbook's own inventory)
- A reusable Revision Checklist table
- The two bugs caught this cycle, generalized into a pattern: font-
  coverage bugs cluster at code/URL boundaries inside translated text,
  higher risk than plain paragraphs
- Key lesson: one concept change costs 4 files x 4 verifications in a
  bilingual multi-format tutorial — budget accordingly

Applied to GSTACK_TUTORIAL_1_WORKFLOW_PLAYBOOK.docx (new H1 section)
and GSTACK_TUTORIAL_1_WORKFLOW_PLAYBOOK_DECK.pptx (+2 slides, 8->10).

Co-Authored-By: Claude Sonnet 5 <noreply@anthropic.com>
</commit_message>
<xml_diff>
--- a/GSTACK_TUTORIAL_1_WORKFLOW_PLAYBOOK.docx
+++ b/GSTACK_TUTORIAL_1_WORKFLOW_PLAYBOOK.docx
@@ -4062,6 +4062,698 @@
           <w:szCs w:val="22"/>
         </w:rPr>
         <w:t xml:space="preserve">Ready for Tutorial #2: pick a new topic, start at Step 1 of the Reusable Prompt Template above.</w:t>
+      </w:r>
+    </w:p>
+    <w:p>
+      <w:r>
+        <w:br w:type="page"/>
+      </w:r>
+    </w:p>
+    <w:p>
+      <w:pPr>
+        <w:pStyle w:val="Heading1"/>
+        <w:pBdr>
+          <w:bottom w:val="single" w:color="1F4E78" w:sz="12" w:space="1"/>
+        </w:pBdr>
+        <w:spacing w:after="200" w:before="400" w:line="360"/>
+      </w:pPr>
+      <w:r>
+        <w:rPr>
+          <w:rFonts w:ascii="Calibri" w:cs="Calibri" w:eastAsia="Calibri" w:hAnsi="Calibri"/>
+          <w:b/>
+          <w:bCs/>
+          <w:color w:val="1F4E78"/>
+          <w:sz w:val="28"/>
+          <w:szCs w:val="28"/>
+        </w:rPr>
+        <w:t xml:space="preserve">Revision Workflow — How This Update Cycle Ran</w:t>
+      </w:r>
+    </w:p>
+    <w:p>
+      <w:pPr>
+        <w:spacing w:after="200" w:line="240"/>
+      </w:pPr>
+      <w:r>
+        <w:rPr>
+          <w:rFonts w:ascii="Calibri" w:cs="Calibri" w:eastAsia="Calibri" w:hAnsi="Calibri"/>
+          <w:sz w:val="22"/>
+          <w:szCs w:val="22"/>
+        </w:rPr>
+        <w:t xml:space="preserve">Tutorial #1 was not written once and left alone. After first publishing all 5 deliverables, a live conceptual question from a user ("where does coding actually happen between PM and Engineer review?") surfaced a real gap, which snowballed into a second gap: the tutorial had no guidance for how students actually practice hands-on or report progress back. This section documents how that revision cycle ran, as a template for the next one.</w:t>
+      </w:r>
+    </w:p>
+    <w:p>
+      <w:pPr>
+        <w:pStyle w:val="Heading2"/>
+        <w:spacing w:after="150" w:before="300" w:line="280"/>
+      </w:pPr>
+      <w:r>
+        <w:rPr>
+          <w:rFonts w:ascii="Calibri" w:cs="Calibri" w:eastAsia="Calibri" w:hAnsi="Calibri"/>
+          <w:b/>
+          <w:bCs/>
+          <w:color w:val="1F4E78"/>
+          <w:sz w:val="24"/>
+          <w:szCs w:val="24"/>
+        </w:rPr>
+        <w:t xml:space="preserve">What Triggered It</w:t>
+      </w:r>
+    </w:p>
+    <w:p>
+      <w:pPr>
+        <w:pStyle w:val="ListParagraph"/>
+        <w:numPr>
+          <w:ilvl w:val="0"/>
+          <w:numId w:val="1"/>
+        </w:numPr>
+        <w:spacing w:after="80" w:before="80" w:line="240"/>
+        <w:ind w:left="0"/>
+      </w:pPr>
+      <w:r>
+        <w:rPr>
+          <w:rFonts w:ascii="Calibri" w:cs="Calibri" w:eastAsia="Calibri" w:hAnsi="Calibri"/>
+          <w:sz w:val="22"/>
+          <w:szCs w:val="22"/>
+        </w:rPr>
+        <w:t xml:space="preserve">A user question about a genuine confusion in the material (not a bug report, not a feature request) — the most valuable trigger for a revision, since it means a real reader got stuck.</w:t>
+      </w:r>
+    </w:p>
+    <w:p>
+      <w:pPr>
+        <w:pStyle w:val="ListParagraph"/>
+        <w:numPr>
+          <w:ilvl w:val="0"/>
+          <w:numId w:val="1"/>
+        </w:numPr>
+        <w:spacing w:after="80" w:before="80" w:line="240"/>
+        <w:ind w:left="0"/>
+      </w:pPr>
+      <w:r>
+        <w:rPr>
+          <w:rFonts w:ascii="Calibri" w:cs="Calibri" w:eastAsia="Calibri" w:hAnsi="Calibri"/>
+          <w:sz w:val="22"/>
+          <w:szCs w:val="22"/>
+        </w:rPr>
+        <w:t xml:space="preserve">Answering the question conversationally was not enough — the fix had to land in the actual documents, or the next reader hits the same wall.</w:t>
+      </w:r>
+    </w:p>
+    <w:p>
+      <w:pPr>
+        <w:pStyle w:val="ListParagraph"/>
+        <w:numPr>
+          <w:ilvl w:val="0"/>
+          <w:numId w:val="1"/>
+        </w:numPr>
+        <w:spacing w:after="80" w:before="80" w:line="240"/>
+        <w:ind w:left="0"/>
+      </w:pPr>
+      <w:r>
+        <w:rPr>
+          <w:rFonts w:ascii="Calibri" w:cs="Calibri" w:eastAsia="Calibri" w:hAnsi="Calibri"/>
+          <w:sz w:val="22"/>
+          <w:szCs w:val="22"/>
+        </w:rPr>
+        <w:t xml:space="preserve">One clarification led to discovering a second, larger gap (collaboration model) once the question was traced back to its root: solo demos don't need forking or reporting; a multi-student rollout does.</w:t>
+      </w:r>
+    </w:p>
+    <w:p>
+      <w:pPr>
+        <w:pStyle w:val="Heading2"/>
+        <w:spacing w:after="150" w:before="300" w:line="280"/>
+      </w:pPr>
+      <w:r>
+        <w:rPr>
+          <w:rFonts w:ascii="Calibri" w:cs="Calibri" w:eastAsia="Calibri" w:hAnsi="Calibri"/>
+          <w:b/>
+          <w:bCs/>
+          <w:color w:val="1F4E78"/>
+          <w:sz w:val="24"/>
+          <w:szCs w:val="24"/>
+        </w:rPr>
+        <w:t xml:space="preserve">The Revision Sequence</w:t>
+      </w:r>
+    </w:p>
+    <w:p>
+      <w:pPr>
+        <w:pStyle w:val="ListParagraph"/>
+        <w:numPr>
+          <w:ilvl w:val="0"/>
+          <w:numId w:val="1"/>
+        </w:numPr>
+        <w:spacing w:after="80" w:before="80" w:line="240"/>
+        <w:ind w:left="0"/>
+      </w:pPr>
+      <w:r>
+        <w:rPr>
+          <w:rFonts w:ascii="Calibri" w:cs="Calibri" w:eastAsia="Calibri" w:hAnsi="Calibri"/>
+          <w:sz w:val="22"/>
+          <w:szCs w:val="22"/>
+        </w:rPr>
+        <w:t xml:space="preserve">1. Answer the immediate question first, conversationally — confirm the fix is right before writing it into 4 files.</w:t>
+      </w:r>
+    </w:p>
+    <w:p>
+      <w:pPr>
+        <w:pStyle w:val="ListParagraph"/>
+        <w:numPr>
+          <w:ilvl w:val="0"/>
+          <w:numId w:val="1"/>
+        </w:numPr>
+        <w:spacing w:after="80" w:before="80" w:line="240"/>
+        <w:ind w:left="0"/>
+      </w:pPr>
+      <w:r>
+        <w:rPr>
+          <w:rFonts w:ascii="Calibri" w:cs="Calibri" w:eastAsia="Calibri" w:hAnsi="Calibri"/>
+          <w:sz w:val="22"/>
+          <w:szCs w:val="22"/>
+        </w:rPr>
+        <w:t xml:space="preserve">2. Update the meta-playbook (this document) FIRST with the new concept — it's the design record, and writing it down here forces the concept to be fully worked out before touching student-facing material.</w:t>
+      </w:r>
+    </w:p>
+    <w:p>
+      <w:pPr>
+        <w:pStyle w:val="ListParagraph"/>
+        <w:numPr>
+          <w:ilvl w:val="0"/>
+          <w:numId w:val="1"/>
+        </w:numPr>
+        <w:spacing w:after="80" w:before="80" w:line="240"/>
+        <w:ind w:left="0"/>
+      </w:pPr>
+      <w:r>
+        <w:rPr>
+          <w:rFonts w:ascii="Calibri" w:cs="Calibri" w:eastAsia="Calibri" w:hAnsi="Calibri"/>
+          <w:sz w:val="22"/>
+          <w:szCs w:val="22"/>
+        </w:rPr>
+        <w:t xml:space="preserve">3. Build any new mechanism the concept needs — here, a real GitHub Issue Template, not just prose describing one.</w:t>
+      </w:r>
+    </w:p>
+    <w:p>
+      <w:pPr>
+        <w:pStyle w:val="ListParagraph"/>
+        <w:numPr>
+          <w:ilvl w:val="0"/>
+          <w:numId w:val="1"/>
+        </w:numPr>
+        <w:spacing w:after="80" w:before="80" w:line="240"/>
+        <w:ind w:left="0"/>
+      </w:pPr>
+      <w:r>
+        <w:rPr>
+          <w:rFonts w:ascii="Calibri" w:cs="Calibri" w:eastAsia="Calibri" w:hAnsi="Calibri"/>
+          <w:sz w:val="22"/>
+          <w:szCs w:val="22"/>
+        </w:rPr>
+        <w:t xml:space="preserve">4. Propagate the SAME conceptual addition into every student-facing file: English docx, Chinese docx, English deck, Chinese deck. Each is a separate generator script — the content is written once conceptually, then re-expressed 4 times in the right language and format.</w:t>
+      </w:r>
+    </w:p>
+    <w:p>
+      <w:pPr>
+        <w:pStyle w:val="ListParagraph"/>
+        <w:numPr>
+          <w:ilvl w:val="0"/>
+          <w:numId w:val="1"/>
+        </w:numPr>
+        <w:spacing w:after="80" w:before="80" w:line="240"/>
+        <w:ind w:left="0"/>
+      </w:pPr>
+      <w:r>
+        <w:rPr>
+          <w:rFonts w:ascii="Calibri" w:cs="Calibri" w:eastAsia="Calibri" w:hAnsi="Calibri"/>
+          <w:sz w:val="22"/>
+          <w:szCs w:val="22"/>
+        </w:rPr>
+        <w:t xml:space="preserve">5. Verify each file independently before commit — never assume a fix that worked in one file works in the others.</w:t>
+      </w:r>
+    </w:p>
+    <w:p>
+      <w:pPr>
+        <w:pStyle w:val="ListParagraph"/>
+        <w:numPr>
+          <w:ilvl w:val="0"/>
+          <w:numId w:val="1"/>
+        </w:numPr>
+        <w:spacing w:after="80" w:before="80" w:line="240"/>
+        <w:ind w:left="0"/>
+      </w:pPr>
+      <w:r>
+        <w:rPr>
+          <w:rFonts w:ascii="Calibri" w:cs="Calibri" w:eastAsia="Calibri" w:hAnsi="Calibri"/>
+          <w:sz w:val="22"/>
+          <w:szCs w:val="22"/>
+        </w:rPr>
+        <w:t xml:space="preserve">6. Commit and push each file (or batch), then checksum-verify against GitHub — download the file back and diff SHA256, don't trust a clean push exit code.</w:t>
+      </w:r>
+    </w:p>
+    <w:p>
+      <w:pPr>
+        <w:pStyle w:val="ListParagraph"/>
+        <w:numPr>
+          <w:ilvl w:val="0"/>
+          <w:numId w:val="1"/>
+        </w:numPr>
+        <w:spacing w:after="80" w:before="80" w:line="240"/>
+        <w:ind w:left="0"/>
+      </w:pPr>
+      <w:r>
+        <w:rPr>
+          <w:rFonts w:ascii="Calibri" w:cs="Calibri" w:eastAsia="Calibri" w:hAnsi="Calibri"/>
+          <w:sz w:val="22"/>
+          <w:szCs w:val="22"/>
+        </w:rPr>
+        <w:t xml:space="preserve">7. Update this playbook's Deliverables Inventory and Prompt Template so the next revision starts from an accurate map.</w:t>
+      </w:r>
+    </w:p>
+    <w:p>
+      <w:pPr>
+        <w:pStyle w:val="Heading2"/>
+        <w:spacing w:after="150" w:before="300" w:line="280"/>
+      </w:pPr>
+      <w:r>
+        <w:rPr>
+          <w:rFonts w:ascii="Calibri" w:cs="Calibri" w:eastAsia="Calibri" w:hAnsi="Calibri"/>
+          <w:b/>
+          <w:bCs/>
+          <w:color w:val="1F4E78"/>
+          <w:sz w:val="24"/>
+          <w:szCs w:val="24"/>
+        </w:rPr>
+        <w:t xml:space="preserve">Revision Checklist (Reusable)</w:t>
+      </w:r>
+    </w:p>
+    <w:tbl>
+      <w:tblPr>
+        <w:tblW w:type="pct" w:w="100%"/>
+        <w:tblBorders>
+          <w:top w:val="single" w:color="auto" w:sz="4"/>
+          <w:left w:val="single" w:color="auto" w:sz="4"/>
+          <w:bottom w:val="single" w:color="auto" w:sz="4"/>
+          <w:right w:val="single" w:color="auto" w:sz="4"/>
+          <w:insideH w:val="single" w:color="auto" w:sz="4"/>
+          <w:insideV w:val="single" w:color="auto" w:sz="4"/>
+        </w:tblBorders>
+      </w:tblPr>
+      <w:tblGrid>
+        <w:gridCol w:w="100"/>
+        <w:gridCol w:w="100"/>
+      </w:tblGrid>
+      <w:tr>
+        <w:tc>
+          <w:tcPr>
+            <w:shd w:fill="1F4E78"/>
+          </w:tcPr>
+          <w:p>
+            <w:r>
+              <w:rPr>
+                <w:rFonts w:ascii="Calibri" w:cs="Calibri" w:eastAsia="Calibri" w:hAnsi="Calibri"/>
+                <w:b/>
+                <w:bCs/>
+                <w:color w:val="FFFFFF"/>
+                <w:sz w:val="19"/>
+                <w:szCs w:val="19"/>
+              </w:rPr>
+              <w:t xml:space="preserve">Step</w:t>
+            </w:r>
+          </w:p>
+        </w:tc>
+        <w:tc>
+          <w:tcPr>
+            <w:shd w:fill="1F4E78"/>
+          </w:tcPr>
+          <w:p>
+            <w:r>
+              <w:rPr>
+                <w:rFonts w:ascii="Calibri" w:cs="Calibri" w:eastAsia="Calibri" w:hAnsi="Calibri"/>
+                <w:b/>
+                <w:bCs/>
+                <w:color w:val="FFFFFF"/>
+                <w:sz w:val="19"/>
+                <w:szCs w:val="19"/>
+              </w:rPr>
+              <w:t xml:space="preserve">Watch For</w:t>
+            </w:r>
+          </w:p>
+        </w:tc>
+      </w:tr>
+      <w:tr>
+        <w:tc>
+          <w:p>
+            <w:r>
+              <w:rPr>
+                <w:rFonts w:ascii="Calibri" w:cs="Calibri" w:eastAsia="Calibri" w:hAnsi="Calibri"/>
+                <w:sz w:val="19"/>
+                <w:szCs w:val="19"/>
+              </w:rPr>
+              <w:t xml:space="preserve">Decide scope: all languages/formats, or one?</w:t>
+            </w:r>
+          </w:p>
+        </w:tc>
+        <w:tc>
+          <w:p>
+            <w:r>
+              <w:rPr>
+                <w:rFonts w:ascii="Calibri" w:cs="Calibri" w:eastAsia="Calibri" w:hAnsi="Calibri"/>
+                <w:sz w:val="19"/>
+                <w:szCs w:val="19"/>
+              </w:rPr>
+              <w:t xml:space="preserve">Most conceptual fixes belong everywhere — a gap in English is a gap in Chinese too</w:t>
+            </w:r>
+          </w:p>
+        </w:tc>
+      </w:tr>
+      <w:tr>
+        <w:tc>
+          <w:p>
+            <w:r>
+              <w:rPr>
+                <w:rFonts w:ascii="Calibri" w:cs="Calibri" w:eastAsia="Calibri" w:hAnsi="Calibri"/>
+                <w:sz w:val="19"/>
+                <w:szCs w:val="19"/>
+              </w:rPr>
+              <w:t xml:space="preserve">Write English content first</w:t>
+            </w:r>
+          </w:p>
+        </w:tc>
+        <w:tc>
+          <w:p>
+            <w:r>
+              <w:rPr>
+                <w:rFonts w:ascii="Calibri" w:cs="Calibri" w:eastAsia="Calibri" w:hAnsi="Calibri"/>
+                <w:sz w:val="19"/>
+                <w:szCs w:val="19"/>
+              </w:rPr>
+              <w:t xml:space="preserve">Source of truth for translation — translate from final English, not draft</w:t>
+            </w:r>
+          </w:p>
+        </w:tc>
+      </w:tr>
+      <w:tr>
+        <w:tc>
+          <w:p>
+            <w:r>
+              <w:rPr>
+                <w:rFonts w:ascii="Calibri" w:cs="Calibri" w:eastAsia="Calibri" w:hAnsi="Calibri"/>
+                <w:sz w:val="19"/>
+                <w:szCs w:val="19"/>
+              </w:rPr>
+              <w:t xml:space="preserve">Translate to Chinese</w:t>
+            </w:r>
+          </w:p>
+        </w:tc>
+        <w:tc>
+          <w:p>
+            <w:r>
+              <w:rPr>
+                <w:rFonts w:ascii="Calibri" w:cs="Calibri" w:eastAsia="Calibri" w:hAnsi="Calibri"/>
+                <w:sz w:val="19"/>
+                <w:szCs w:val="19"/>
+              </w:rPr>
+              <w:t xml:space="preserve">Apply the CJK font to every run — including ones mixed with code/URLs (see bug below)</w:t>
+            </w:r>
+          </w:p>
+        </w:tc>
+      </w:tr>
+      <w:tr>
+        <w:tc>
+          <w:p>
+            <w:r>
+              <w:rPr>
+                <w:rFonts w:ascii="Calibri" w:cs="Calibri" w:eastAsia="Calibri" w:hAnsi="Calibri"/>
+                <w:sz w:val="19"/>
+                <w:szCs w:val="19"/>
+              </w:rPr>
+              <w:t xml:space="preserve">Insert into docx via script edit</w:t>
+            </w:r>
+          </w:p>
+        </w:tc>
+        <w:tc>
+          <w:p>
+            <w:r>
+              <w:rPr>
+                <w:rFonts w:ascii="Calibri" w:cs="Calibri" w:eastAsia="Calibri" w:hAnsi="Calibri"/>
+                <w:sz w:val="19"/>
+                <w:szCs w:val="19"/>
+              </w:rPr>
+              <w:t xml:space="preserve">Edit the generator script, never hand-edit XML directly</w:t>
+            </w:r>
+          </w:p>
+        </w:tc>
+      </w:tr>
+      <w:tr>
+        <w:tc>
+          <w:p>
+            <w:r>
+              <w:rPr>
+                <w:rFonts w:ascii="Calibri" w:cs="Calibri" w:eastAsia="Calibri" w:hAnsi="Calibri"/>
+                <w:sz w:val="19"/>
+                <w:szCs w:val="19"/>
+              </w:rPr>
+              <w:t xml:space="preserve">Insert into pptx via script edit</w:t>
+            </w:r>
+          </w:p>
+        </w:tc>
+        <w:tc>
+          <w:p>
+            <w:r>
+              <w:rPr>
+                <w:rFonts w:ascii="Calibri" w:cs="Calibri" w:eastAsia="Calibri" w:hAnsi="Calibri"/>
+                <w:sz w:val="19"/>
+                <w:szCs w:val="19"/>
+              </w:rPr>
+              <w:t xml:space="preserve">Decide: callout on existing slide (docx has room) vs. new slide (pptx usually needs one — less room per slide)</w:t>
+            </w:r>
+          </w:p>
+        </w:tc>
+      </w:tr>
+      <w:tr>
+        <w:tc>
+          <w:p>
+            <w:r>
+              <w:rPr>
+                <w:rFonts w:ascii="Calibri" w:cs="Calibri" w:eastAsia="Calibri" w:hAnsi="Calibri"/>
+                <w:sz w:val="19"/>
+                <w:szCs w:val="19"/>
+              </w:rPr>
+              <w:t xml:space="preserve">Verify EACH file independently</w:t>
+            </w:r>
+          </w:p>
+        </w:tc>
+        <w:tc>
+          <w:p>
+            <w:r>
+              <w:rPr>
+                <w:rFonts w:ascii="Calibri" w:cs="Calibri" w:eastAsia="Calibri" w:hAnsi="Calibri"/>
+                <w:sz w:val="19"/>
+                <w:szCs w:val="19"/>
+              </w:rPr>
+              <w:t xml:space="preserve">Schema, duplicate-run check, CJK-font-coverage, geometry (pptx), content-presence</w:t>
+            </w:r>
+          </w:p>
+        </w:tc>
+      </w:tr>
+      <w:tr>
+        <w:tc>
+          <w:p>
+            <w:r>
+              <w:rPr>
+                <w:rFonts w:ascii="Calibri" w:cs="Calibri" w:eastAsia="Calibri" w:hAnsi="Calibri"/>
+                <w:sz w:val="19"/>
+                <w:szCs w:val="19"/>
+              </w:rPr>
+              <w:t xml:space="preserve">Watch for file locks</w:t>
+            </w:r>
+          </w:p>
+        </w:tc>
+        <w:tc>
+          <w:p>
+            <w:r>
+              <w:rPr>
+                <w:rFonts w:ascii="Calibri" w:cs="Calibri" w:eastAsia="Calibri" w:hAnsi="Calibri"/>
+                <w:sz w:val="19"/>
+                <w:szCs w:val="19"/>
+              </w:rPr>
+              <w:t xml:space="preserve">If the human has it open in Word/PowerPoint: write to _v2, ask them to close it, swap in after</w:t>
+            </w:r>
+          </w:p>
+        </w:tc>
+      </w:tr>
+      <w:tr>
+        <w:tc>
+          <w:p>
+            <w:r>
+              <w:rPr>
+                <w:rFonts w:ascii="Calibri" w:cs="Calibri" w:eastAsia="Calibri" w:hAnsi="Calibri"/>
+                <w:sz w:val="19"/>
+                <w:szCs w:val="19"/>
+              </w:rPr>
+              <w:t xml:space="preserve">Commit with a clear message</w:t>
+            </w:r>
+          </w:p>
+        </w:tc>
+        <w:tc>
+          <w:p>
+            <w:r>
+              <w:rPr>
+                <w:rFonts w:ascii="Calibri" w:cs="Calibri" w:eastAsia="Calibri" w:hAnsi="Calibri"/>
+                <w:sz w:val="19"/>
+                <w:szCs w:val="19"/>
+              </w:rPr>
+              <w:t xml:space="preserve">State what changed and why, not just "update docs"</w:t>
+            </w:r>
+          </w:p>
+        </w:tc>
+      </w:tr>
+      <w:tr>
+        <w:tc>
+          <w:p>
+            <w:r>
+              <w:rPr>
+                <w:rFonts w:ascii="Calibri" w:cs="Calibri" w:eastAsia="Calibri" w:hAnsi="Calibri"/>
+                <w:sz w:val="19"/>
+                <w:szCs w:val="19"/>
+              </w:rPr>
+              <w:t xml:space="preserve">Push, then checksum-verify</w:t>
+            </w:r>
+          </w:p>
+        </w:tc>
+        <w:tc>
+          <w:p>
+            <w:r>
+              <w:rPr>
+                <w:rFonts w:ascii="Calibri" w:cs="Calibri" w:eastAsia="Calibri" w:hAnsi="Calibri"/>
+                <w:sz w:val="19"/>
+                <w:szCs w:val="19"/>
+              </w:rPr>
+              <w:t xml:space="preserve">sha256 local vs. downloaded-from-GitHub — a clean git push is not proof of anything</w:t>
+            </w:r>
+          </w:p>
+        </w:tc>
+      </w:tr>
+      <w:tr>
+        <w:tc>
+          <w:p>
+            <w:r>
+              <w:rPr>
+                <w:rFonts w:ascii="Calibri" w:cs="Calibri" w:eastAsia="Calibri" w:hAnsi="Calibri"/>
+                <w:sz w:val="19"/>
+                <w:szCs w:val="19"/>
+              </w:rPr>
+              <w:t xml:space="preserve">Update this playbook</w:t>
+            </w:r>
+          </w:p>
+        </w:tc>
+        <w:tc>
+          <w:p>
+            <w:r>
+              <w:rPr>
+                <w:rFonts w:ascii="Calibri" w:cs="Calibri" w:eastAsia="Calibri" w:hAnsi="Calibri"/>
+                <w:sz w:val="19"/>
+                <w:szCs w:val="19"/>
+              </w:rPr>
+              <w:t xml:space="preserve">Log the new pattern here too, so the NEXT revision starts from a complete map</w:t>
+            </w:r>
+          </w:p>
+        </w:tc>
+      </w:tr>
+    </w:tbl>
+    <w:p>
+      <w:pPr>
+        <w:pStyle w:val="Heading2"/>
+        <w:spacing w:after="150" w:before="300" w:line="280"/>
+      </w:pPr>
+      <w:r>
+        <w:rPr>
+          <w:rFonts w:ascii="Calibri" w:cs="Calibri" w:eastAsia="Calibri" w:hAnsi="Calibri"/>
+          <w:b/>
+          <w:bCs/>
+          <w:color w:val="1F4E78"/>
+          <w:sz w:val="24"/>
+          <w:szCs w:val="24"/>
+        </w:rPr>
+        <w:t xml:space="preserve">Bugs Caught During This Revision</w:t>
+      </w:r>
+    </w:p>
+    <w:p>
+      <w:pPr>
+        <w:spacing w:after="200" w:line="240"/>
+      </w:pPr>
+      <w:r>
+        <w:rPr>
+          <w:rFonts w:ascii="Calibri" w:cs="Calibri" w:eastAsia="Calibri" w:hAnsi="Calibri"/>
+          <w:sz w:val="22"/>
+          <w:szCs w:val="22"/>
+        </w:rPr>
+        <w:t xml:space="preserve">Both were caught by the verification checklist above, before either file was committed — not discovered afterward by a reader.</w:t>
+      </w:r>
+    </w:p>
+    <w:p>
+      <w:pPr>
+        <w:pStyle w:val="ListParagraph"/>
+        <w:numPr>
+          <w:ilvl w:val="0"/>
+          <w:numId w:val="1"/>
+        </w:numPr>
+        <w:spacing w:after="80" w:before="80" w:line="240"/>
+        <w:ind w:left="0"/>
+      </w:pPr>
+      <w:r>
+        <w:rPr>
+          <w:rFonts w:ascii="Calibri" w:cs="Calibri" w:eastAsia="Calibri" w:hAnsi="Calibri"/>
+          <w:sz w:val="22"/>
+          <w:szCs w:val="22"/>
+        </w:rPr>
+        <w:t xml:space="preserve">A Chinese placeholder was embedded inside a monospace, Consolas-fonted git command string during translation — no CJK font was declared for that specific run, since the whole run was styled as "code," not "Chinese prose." Fixed by using an English placeholder there instead (GitHub usernames are ASCII-only anyway, so this was also simply more correct).</w:t>
+      </w:r>
+    </w:p>
+    <w:p>
+      <w:pPr>
+        <w:pStyle w:val="ListParagraph"/>
+        <w:numPr>
+          <w:ilvl w:val="0"/>
+          <w:numId w:val="1"/>
+        </w:numPr>
+        <w:spacing w:after="80" w:before="80" w:line="240"/>
+        <w:ind w:left="0"/>
+      </w:pPr>
+      <w:r>
+        <w:rPr>
+          <w:rFonts w:ascii="Calibri" w:cs="Calibri" w:eastAsia="Calibri" w:hAnsi="Calibri"/>
+          <w:sz w:val="22"/>
+          <w:szCs w:val="22"/>
+        </w:rPr>
+        <w:t xml:space="preserve">The general pattern: font-coverage bugs cluster at code/URL boundaries inside translated content — a run that mixes literal command syntax with translated prose is the highest-risk spot, more so than plain paragraphs of Chinese text.</w:t>
+      </w:r>
+    </w:p>
+    <w:p>
+      <w:pPr>
+        <w:pStyle w:val="Heading2"/>
+        <w:spacing w:after="150" w:before="300" w:line="280"/>
+      </w:pPr>
+      <w:r>
+        <w:rPr>
+          <w:rFonts w:ascii="Calibri" w:cs="Calibri" w:eastAsia="Calibri" w:hAnsi="Calibri"/>
+          <w:b/>
+          <w:bCs/>
+          <w:color w:val="1F4E78"/>
+          <w:sz w:val="24"/>
+          <w:szCs w:val="24"/>
+        </w:rPr>
+        <w:t xml:space="preserve">Key Lesson: One Concept, Four Files, Four Verifications</w:t>
+      </w:r>
+    </w:p>
+    <w:p>
+      <w:pPr>
+        <w:spacing w:after="200" w:line="240"/>
+      </w:pPr>
+      <w:r>
+        <w:rPr>
+          <w:rFonts w:ascii="Calibri" w:cs="Calibri" w:eastAsia="Calibri" w:hAnsi="Calibri"/>
+          <w:sz w:val="22"/>
+          <w:szCs w:val="22"/>
+        </w:rPr>
+        <w:t xml:space="preserve">Adding "one idea" to a bilingual, multi-format tutorial is never a single edit. It is: write the concept once, then re-express it correctly in 2 languages across 2 formats (4 independent generator scripts), each requiring its own full verification pass. A revision that looks like "add a section" is really "add a section 4 times, verify it 4 times." Budget time accordingly — this revision touched 4 deliverable files plus 2 new GitHub Issue Template files plus this playbook, for what started as a single conceptual clarification.</w:t>
       </w:r>
     </w:p>
     <w:sectPr>

</xml_diff>